<commit_message>
Add 2부 7–8화 scripts; fix Bah grandson continuity
Co-Authored-By: Claude Sonnet 5.5 <noreply@anthropic.com>
Claude-Session: https://claude.ai/code/session_013X2zbh4kERceyuaxxZfq31
</commit_message>
<xml_diff>
--- a/Diplomata_ES/docx/2부4화_La_notaria.docx
+++ b/Diplomata_ES/docx/2부4화_La_notaria.docx
@@ -7104,7 +7104,7 @@
           <w:i w:val="0"/>
           <w:sz w:val="22"/>
         </w:rPr>
-        <w:t>Traiga el papel. Lo firmaré. Pero no quiero que mi hijo lo vea hasta que sea mayor.</w:t>
+        <w:t>Traiga el papel. Lo firmaré. Pero no quiero que mi nieto lo vea hasta que sea mayor.</w:t>
       </w:r>
     </w:p>
     <w:p>
@@ -7120,7 +7120,7 @@
           <w:color w:val="555555"/>
           <w:sz w:val="19"/>
         </w:rPr>
-        <w:t>서류를 가져오시오. 서명하겠소. 하지만 아들이 어른이 될 때까지 보지 않았으면 하오.</w:t>
+        <w:t>서류를 가져오시오. 서명하겠소. 하지만 손자가 어른이 될 때까지 보지 않았으면 하오.</w:t>
       </w:r>
     </w:p>
     <w:p>

</xml_diff>